<commit_message>
Vaatimusmäärittelypohja ja työtunteja laitettu
</commit_message>
<xml_diff>
--- a/työnseuranta/Työaikaraportti - Kati.docx
+++ b/työnseuranta/Työaikaraportti - Kati.docx
@@ -233,79 +233,145 @@
           <w:tcPr>
             <w:tcW w:w="1980" w:type="dxa"/>
           </w:tcPr>
-          <w:p/>
-        </w:tc>
-        <w:tc>
-          <w:tcPr>
-            <w:tcW w:w="2551" w:type="dxa"/>
-          </w:tcPr>
-          <w:p/>
-        </w:tc>
-        <w:tc>
-          <w:tcPr>
-            <w:tcW w:w="5103" w:type="dxa"/>
-          </w:tcPr>
-          <w:p/>
-        </w:tc>
-      </w:tr>
-      <w:tr>
-        <w:tc>
-          <w:tcPr>
-            <w:tcW w:w="1980" w:type="dxa"/>
-          </w:tcPr>
-          <w:p/>
-        </w:tc>
-        <w:tc>
-          <w:tcPr>
-            <w:tcW w:w="2551" w:type="dxa"/>
-          </w:tcPr>
-          <w:p/>
-        </w:tc>
-        <w:tc>
-          <w:tcPr>
-            <w:tcW w:w="5103" w:type="dxa"/>
-          </w:tcPr>
-          <w:p/>
-        </w:tc>
-      </w:tr>
-      <w:tr>
-        <w:tc>
-          <w:tcPr>
-            <w:tcW w:w="1980" w:type="dxa"/>
-          </w:tcPr>
-          <w:p/>
-        </w:tc>
-        <w:tc>
-          <w:tcPr>
-            <w:tcW w:w="2551" w:type="dxa"/>
-          </w:tcPr>
-          <w:p/>
-        </w:tc>
-        <w:tc>
-          <w:tcPr>
-            <w:tcW w:w="5103" w:type="dxa"/>
-          </w:tcPr>
-          <w:p/>
-        </w:tc>
-      </w:tr>
-      <w:tr>
-        <w:tc>
-          <w:tcPr>
-            <w:tcW w:w="1980" w:type="dxa"/>
-          </w:tcPr>
-          <w:p/>
-        </w:tc>
-        <w:tc>
-          <w:tcPr>
-            <w:tcW w:w="2551" w:type="dxa"/>
-          </w:tcPr>
-          <w:p/>
-        </w:tc>
-        <w:tc>
-          <w:tcPr>
-            <w:tcW w:w="5103" w:type="dxa"/>
-          </w:tcPr>
-          <w:p/>
+          <w:p>
+            <w:r>
+              <w:t>19.9</w:t>
+            </w:r>
+          </w:p>
+        </w:tc>
+        <w:tc>
+          <w:tcPr>
+            <w:tcW w:w="2551" w:type="dxa"/>
+          </w:tcPr>
+          <w:p>
+            <w:r>
+              <w:t>1h 30min</w:t>
+            </w:r>
+          </w:p>
+        </w:tc>
+        <w:tc>
+          <w:tcPr>
+            <w:tcW w:w="5103" w:type="dxa"/>
+          </w:tcPr>
+          <w:p>
+            <w:r>
+              <w:t xml:space="preserve">pari </w:t>
+            </w:r>
+            <w:proofErr w:type="spellStart"/>
+            <w:r>
+              <w:t>wpf</w:t>
+            </w:r>
+            <w:proofErr w:type="spellEnd"/>
+            <w:r>
+              <w:t xml:space="preserve"> </w:t>
+            </w:r>
+            <w:r>
+              <w:t>tutoriaalia</w:t>
+            </w:r>
+          </w:p>
+        </w:tc>
+      </w:tr>
+      <w:tr>
+        <w:tc>
+          <w:tcPr>
+            <w:tcW w:w="1980" w:type="dxa"/>
+          </w:tcPr>
+          <w:p>
+            <w:r>
+              <w:t>20.9</w:t>
+            </w:r>
+          </w:p>
+        </w:tc>
+        <w:tc>
+          <w:tcPr>
+            <w:tcW w:w="2551" w:type="dxa"/>
+          </w:tcPr>
+          <w:p/>
+        </w:tc>
+        <w:tc>
+          <w:tcPr>
+            <w:tcW w:w="5103" w:type="dxa"/>
+          </w:tcPr>
+          <w:p/>
+        </w:tc>
+      </w:tr>
+      <w:tr>
+        <w:tc>
+          <w:tcPr>
+            <w:tcW w:w="1980" w:type="dxa"/>
+          </w:tcPr>
+          <w:p>
+            <w:r>
+              <w:t>21.9</w:t>
+            </w:r>
+          </w:p>
+        </w:tc>
+        <w:tc>
+          <w:tcPr>
+            <w:tcW w:w="2551" w:type="dxa"/>
+          </w:tcPr>
+          <w:p>
+            <w:proofErr w:type="gramStart"/>
+            <w:r>
+              <w:t>2</w:t>
+            </w:r>
+            <w:r>
+              <w:t>h</w:t>
+            </w:r>
+            <w:proofErr w:type="gramEnd"/>
+          </w:p>
+        </w:tc>
+        <w:tc>
+          <w:tcPr>
+            <w:tcW w:w="5103" w:type="dxa"/>
+          </w:tcPr>
+          <w:p>
+            <w:r>
+              <w:t xml:space="preserve">tutoriaalit </w:t>
+            </w:r>
+            <w:r>
+              <w:t xml:space="preserve">ajanotosta ja tietojen tallentamisesta </w:t>
+            </w:r>
+          </w:p>
+        </w:tc>
+      </w:tr>
+      <w:tr>
+        <w:tc>
+          <w:tcPr>
+            <w:tcW w:w="1980" w:type="dxa"/>
+          </w:tcPr>
+          <w:p>
+            <w:r>
+              <w:t>22.9</w:t>
+            </w:r>
+          </w:p>
+        </w:tc>
+        <w:tc>
+          <w:tcPr>
+            <w:tcW w:w="2551" w:type="dxa"/>
+          </w:tcPr>
+          <w:p/>
+        </w:tc>
+        <w:tc>
+          <w:tcPr>
+            <w:tcW w:w="5103" w:type="dxa"/>
+          </w:tcPr>
+          <w:p>
+            <w:proofErr w:type="spellStart"/>
+            <w:r>
+              <w:t>scrum</w:t>
+            </w:r>
+            <w:proofErr w:type="spellEnd"/>
+            <w:r>
+              <w:t xml:space="preserve"> palaveri,</w:t>
+            </w:r>
+            <w:r>
+              <w:t xml:space="preserve"> Testiversio missä</w:t>
+            </w:r>
+            <w:r>
+              <w:t xml:space="preserve"> aloitetaan ja lopetetaan ajanotto (tallennus ei vielä onnistunut)</w:t>
+            </w:r>
+          </w:p>
         </w:tc>
       </w:tr>
       <w:tr>

</xml_diff>

<commit_message>
Työaika ja vaatimusmäärittelyyn muutoksia
</commit_message>
<xml_diff>
--- a/työnseuranta/Työaikaraportti - Kati.docx
+++ b/työnseuranta/Työaikaraportti - Kati.docx
@@ -94,7 +94,6 @@
                 <w:bCs/>
               </w:rPr>
             </w:pPr>
-            <w:proofErr w:type="gramStart"/>
             <w:r>
               <w:rPr>
                 <w:b/>
@@ -102,7 +101,6 @@
               </w:rPr>
               <w:t>Pvm</w:t>
             </w:r>
-            <w:proofErr w:type="gramEnd"/>
           </w:p>
         </w:tc>
         <w:tc>
@@ -174,13 +172,8 @@
             <w:tcW w:w="5103" w:type="dxa"/>
           </w:tcPr>
           <w:p>
-            <w:proofErr w:type="spellStart"/>
-            <w:r>
-              <w:t>github</w:t>
-            </w:r>
-            <w:proofErr w:type="spellEnd"/>
-            <w:r>
-              <w:t xml:space="preserve"> repo, </w:t>
+            <w:r>
+              <w:t xml:space="preserve">github repo, </w:t>
             </w:r>
             <w:r>
               <w:t>projektin aiheen lopullinen päätös, alustavien ideoiden heittely ja pikainen projektisuunnitelma</w:t>
@@ -215,13 +208,8 @@
           </w:tcPr>
           <w:p>
             <w:r>
-              <w:t xml:space="preserve">WPF tutoriaaleja, </w:t>
-            </w:r>
-            <w:proofErr w:type="spellStart"/>
-            <w:r>
-              <w:t>scrum</w:t>
-            </w:r>
-            <w:proofErr w:type="spellEnd"/>
+              <w:t>WPF tutoriaaleja, scrum</w:t>
+            </w:r>
             <w:r>
               <w:t>-tiimipalaveri, harjoitus version aloitus</w:t>
             </w:r>
@@ -257,13 +245,8 @@
             <w:r>
               <w:t xml:space="preserve">pari </w:t>
             </w:r>
-            <w:proofErr w:type="spellStart"/>
-            <w:r>
-              <w:t>wpf</w:t>
-            </w:r>
-            <w:proofErr w:type="spellEnd"/>
-            <w:r>
-              <w:t xml:space="preserve"> </w:t>
+            <w:r>
+              <w:t xml:space="preserve">wpf </w:t>
             </w:r>
             <w:r>
               <w:t>tutoriaalia</w:t>
@@ -311,14 +294,12 @@
             <w:tcW w:w="2551" w:type="dxa"/>
           </w:tcPr>
           <w:p>
-            <w:proofErr w:type="gramStart"/>
             <w:r>
               <w:t>2</w:t>
             </w:r>
             <w:r>
               <w:t>h</w:t>
             </w:r>
-            <w:proofErr w:type="gramEnd"/>
           </w:p>
         </w:tc>
         <w:tc>
@@ -361,13 +342,8 @@
             <w:tcW w:w="5103" w:type="dxa"/>
           </w:tcPr>
           <w:p>
-            <w:proofErr w:type="spellStart"/>
-            <w:r>
-              <w:t>scrum</w:t>
-            </w:r>
-            <w:proofErr w:type="spellEnd"/>
-            <w:r>
-              <w:t xml:space="preserve"> palaveri,</w:t>
+            <w:r>
+              <w:t>scrum palaveri,</w:t>
             </w:r>
             <w:r>
               <w:t xml:space="preserve"> Testiversio missä</w:t>
@@ -418,25 +394,18 @@
             <w:tcW w:w="2551" w:type="dxa"/>
           </w:tcPr>
           <w:p>
-            <w:proofErr w:type="gramStart"/>
             <w:r>
               <w:t>2h</w:t>
             </w:r>
-            <w:proofErr w:type="gramEnd"/>
-          </w:p>
-        </w:tc>
-        <w:tc>
-          <w:tcPr>
-            <w:tcW w:w="5103" w:type="dxa"/>
-          </w:tcPr>
-          <w:p>
-            <w:proofErr w:type="spellStart"/>
-            <w:r>
-              <w:t>wpf</w:t>
-            </w:r>
-            <w:proofErr w:type="spellEnd"/>
-            <w:r>
-              <w:t xml:space="preserve"> testiversio</w:t>
+          </w:p>
+        </w:tc>
+        <w:tc>
+          <w:tcPr>
+            <w:tcW w:w="5103" w:type="dxa"/>
+          </w:tcPr>
+          <w:p>
+            <w:r>
+              <w:t>wpf testiversio</w:t>
             </w:r>
             <w:r>
               <w:t>,</w:t>
@@ -465,20 +434,19 @@
           <w:tcPr>
             <w:tcW w:w="2551" w:type="dxa"/>
           </w:tcPr>
-          <w:p/>
-        </w:tc>
-        <w:tc>
-          <w:tcPr>
-            <w:tcW w:w="5103" w:type="dxa"/>
-          </w:tcPr>
-          <w:p>
-            <w:proofErr w:type="spellStart"/>
-            <w:r>
-              <w:t>assari</w:t>
-            </w:r>
-            <w:proofErr w:type="spellEnd"/>
-            <w:r>
-              <w:t xml:space="preserve"> tunti</w:t>
+          <w:p>
+            <w:r>
+              <w:t>3h</w:t>
+            </w:r>
+          </w:p>
+        </w:tc>
+        <w:tc>
+          <w:tcPr>
+            <w:tcW w:w="5103" w:type="dxa"/>
+          </w:tcPr>
+          <w:p>
+            <w:r>
+              <w:t>assari tunti</w:t>
             </w:r>
             <w:r>
               <w:t>, ja tiimin kanssa asioiden läpikäymistä. JSON testailua</w:t>
@@ -491,127 +459,185 @@
           <w:tcPr>
             <w:tcW w:w="1980" w:type="dxa"/>
           </w:tcPr>
-          <w:p/>
-        </w:tc>
-        <w:tc>
-          <w:tcPr>
-            <w:tcW w:w="2551" w:type="dxa"/>
-          </w:tcPr>
-          <w:p/>
-        </w:tc>
-        <w:tc>
-          <w:tcPr>
-            <w:tcW w:w="5103" w:type="dxa"/>
-          </w:tcPr>
-          <w:p/>
-        </w:tc>
-      </w:tr>
-      <w:tr>
-        <w:tc>
-          <w:tcPr>
-            <w:tcW w:w="1980" w:type="dxa"/>
-          </w:tcPr>
-          <w:p/>
-        </w:tc>
-        <w:tc>
-          <w:tcPr>
-            <w:tcW w:w="2551" w:type="dxa"/>
-          </w:tcPr>
-          <w:p/>
-        </w:tc>
-        <w:tc>
-          <w:tcPr>
-            <w:tcW w:w="5103" w:type="dxa"/>
-          </w:tcPr>
-          <w:p/>
-        </w:tc>
-      </w:tr>
-      <w:tr>
-        <w:tc>
-          <w:tcPr>
-            <w:tcW w:w="1980" w:type="dxa"/>
-          </w:tcPr>
-          <w:p/>
-        </w:tc>
-        <w:tc>
-          <w:tcPr>
-            <w:tcW w:w="2551" w:type="dxa"/>
-          </w:tcPr>
-          <w:p/>
-        </w:tc>
-        <w:tc>
-          <w:tcPr>
-            <w:tcW w:w="5103" w:type="dxa"/>
-          </w:tcPr>
-          <w:p/>
-        </w:tc>
-      </w:tr>
-      <w:tr>
-        <w:tc>
-          <w:tcPr>
-            <w:tcW w:w="1980" w:type="dxa"/>
-          </w:tcPr>
-          <w:p/>
-        </w:tc>
-        <w:tc>
-          <w:tcPr>
-            <w:tcW w:w="2551" w:type="dxa"/>
-          </w:tcPr>
-          <w:p/>
-        </w:tc>
-        <w:tc>
-          <w:tcPr>
-            <w:tcW w:w="5103" w:type="dxa"/>
-          </w:tcPr>
-          <w:p/>
-        </w:tc>
-      </w:tr>
-      <w:tr>
-        <w:tc>
-          <w:tcPr>
-            <w:tcW w:w="1980" w:type="dxa"/>
-          </w:tcPr>
-          <w:p/>
-        </w:tc>
-        <w:tc>
-          <w:tcPr>
-            <w:tcW w:w="2551" w:type="dxa"/>
-          </w:tcPr>
-          <w:p/>
-        </w:tc>
-        <w:tc>
-          <w:tcPr>
-            <w:tcW w:w="5103" w:type="dxa"/>
-          </w:tcPr>
-          <w:p/>
-        </w:tc>
-      </w:tr>
-      <w:tr>
-        <w:tc>
-          <w:tcPr>
-            <w:tcW w:w="1980" w:type="dxa"/>
-          </w:tcPr>
-          <w:p/>
-        </w:tc>
-        <w:tc>
-          <w:tcPr>
-            <w:tcW w:w="2551" w:type="dxa"/>
-          </w:tcPr>
-          <w:p/>
-        </w:tc>
-        <w:tc>
-          <w:tcPr>
-            <w:tcW w:w="5103" w:type="dxa"/>
-          </w:tcPr>
-          <w:p/>
-        </w:tc>
-      </w:tr>
-      <w:tr>
-        <w:tc>
-          <w:tcPr>
-            <w:tcW w:w="1980" w:type="dxa"/>
-          </w:tcPr>
-          <w:p/>
+          <w:p>
+            <w:r>
+              <w:t>26.9</w:t>
+            </w:r>
+          </w:p>
+        </w:tc>
+        <w:tc>
+          <w:tcPr>
+            <w:tcW w:w="2551" w:type="dxa"/>
+          </w:tcPr>
+          <w:p/>
+        </w:tc>
+        <w:tc>
+          <w:tcPr>
+            <w:tcW w:w="5103" w:type="dxa"/>
+          </w:tcPr>
+          <w:p/>
+        </w:tc>
+      </w:tr>
+      <w:tr>
+        <w:tc>
+          <w:tcPr>
+            <w:tcW w:w="1980" w:type="dxa"/>
+          </w:tcPr>
+          <w:p>
+            <w:r>
+              <w:t>27.9</w:t>
+            </w:r>
+          </w:p>
+        </w:tc>
+        <w:tc>
+          <w:tcPr>
+            <w:tcW w:w="2551" w:type="dxa"/>
+          </w:tcPr>
+          <w:p>
+            <w:r>
+              <w:t>1h</w:t>
+            </w:r>
+          </w:p>
+        </w:tc>
+        <w:tc>
+          <w:tcPr>
+            <w:tcW w:w="5103" w:type="dxa"/>
+          </w:tcPr>
+          <w:p>
+            <w:r>
+              <w:t>Mainwindow UI ilman mitään toimintoja</w:t>
+            </w:r>
+          </w:p>
+        </w:tc>
+      </w:tr>
+      <w:tr>
+        <w:tc>
+          <w:tcPr>
+            <w:tcW w:w="1980" w:type="dxa"/>
+          </w:tcPr>
+          <w:p>
+            <w:r>
+              <w:t>28.9</w:t>
+            </w:r>
+          </w:p>
+        </w:tc>
+        <w:tc>
+          <w:tcPr>
+            <w:tcW w:w="2551" w:type="dxa"/>
+          </w:tcPr>
+          <w:p>
+            <w:r>
+              <w:t>1h</w:t>
+            </w:r>
+          </w:p>
+        </w:tc>
+        <w:tc>
+          <w:tcPr>
+            <w:tcW w:w="5103" w:type="dxa"/>
+          </w:tcPr>
+          <w:p>
+            <w:r>
+              <w:t>muistiinpanoja vaatimusmäärittelyyn</w:t>
+            </w:r>
+          </w:p>
+        </w:tc>
+      </w:tr>
+      <w:tr>
+        <w:tc>
+          <w:tcPr>
+            <w:tcW w:w="1980" w:type="dxa"/>
+          </w:tcPr>
+          <w:p>
+            <w:r>
+              <w:t>29.9</w:t>
+            </w:r>
+          </w:p>
+        </w:tc>
+        <w:tc>
+          <w:tcPr>
+            <w:tcW w:w="2551" w:type="dxa"/>
+          </w:tcPr>
+          <w:p>
+            <w:r>
+              <w:t>1h</w:t>
+            </w:r>
+            <w:r>
+              <w:t xml:space="preserve"> 30 min</w:t>
+            </w:r>
+          </w:p>
+        </w:tc>
+        <w:tc>
+          <w:tcPr>
+            <w:tcW w:w="5103" w:type="dxa"/>
+          </w:tcPr>
+          <w:p>
+            <w:r>
+              <w:t>scrum palaveri tiimin kanssa</w:t>
+            </w:r>
+            <w:r>
+              <w:t>, vaatimusmäärittely</w:t>
+            </w:r>
+          </w:p>
+        </w:tc>
+      </w:tr>
+      <w:tr>
+        <w:tc>
+          <w:tcPr>
+            <w:tcW w:w="1980" w:type="dxa"/>
+          </w:tcPr>
+          <w:p>
+            <w:r>
+              <w:t>30.9</w:t>
+            </w:r>
+          </w:p>
+        </w:tc>
+        <w:tc>
+          <w:tcPr>
+            <w:tcW w:w="2551" w:type="dxa"/>
+          </w:tcPr>
+          <w:p/>
+        </w:tc>
+        <w:tc>
+          <w:tcPr>
+            <w:tcW w:w="5103" w:type="dxa"/>
+          </w:tcPr>
+          <w:p/>
+        </w:tc>
+      </w:tr>
+      <w:tr>
+        <w:tc>
+          <w:tcPr>
+            <w:tcW w:w="1980" w:type="dxa"/>
+          </w:tcPr>
+          <w:p>
+            <w:r>
+              <w:t>1.10</w:t>
+            </w:r>
+          </w:p>
+        </w:tc>
+        <w:tc>
+          <w:tcPr>
+            <w:tcW w:w="2551" w:type="dxa"/>
+          </w:tcPr>
+          <w:p/>
+        </w:tc>
+        <w:tc>
+          <w:tcPr>
+            <w:tcW w:w="5103" w:type="dxa"/>
+          </w:tcPr>
+          <w:p/>
+        </w:tc>
+      </w:tr>
+      <w:tr>
+        <w:tc>
+          <w:tcPr>
+            <w:tcW w:w="1980" w:type="dxa"/>
+          </w:tcPr>
+          <w:p>
+            <w:r>
+              <w:t>2.10</w:t>
+            </w:r>
+          </w:p>
         </w:tc>
         <w:tc>
           <w:tcPr>

</xml_diff>

<commit_message>
työaikamuutos ja solmun testaus
</commit_message>
<xml_diff>
--- a/työnseuranta/Työaikaraportti - Kati.docx
+++ b/työnseuranta/Työaikaraportti - Kati.docx
@@ -94,6 +94,7 @@
                 <w:bCs/>
               </w:rPr>
             </w:pPr>
+            <w:proofErr w:type="gramStart"/>
             <w:r>
               <w:rPr>
                 <w:b/>
@@ -101,6 +102,7 @@
               </w:rPr>
               <w:t>Pvm</w:t>
             </w:r>
+            <w:proofErr w:type="gramEnd"/>
           </w:p>
         </w:tc>
         <w:tc>
@@ -172,8 +174,13 @@
             <w:tcW w:w="5103" w:type="dxa"/>
           </w:tcPr>
           <w:p>
-            <w:r>
-              <w:t xml:space="preserve">github repo, </w:t>
+            <w:proofErr w:type="spellStart"/>
+            <w:r>
+              <w:t>github</w:t>
+            </w:r>
+            <w:proofErr w:type="spellEnd"/>
+            <w:r>
+              <w:t xml:space="preserve"> repo, </w:t>
             </w:r>
             <w:r>
               <w:t>projektin aiheen lopullinen päätös, alustavien ideoiden heittely ja pikainen projektisuunnitelma</w:t>
@@ -197,19 +204,26 @@
             <w:tcW w:w="2551" w:type="dxa"/>
           </w:tcPr>
           <w:p>
+            <w:proofErr w:type="gramStart"/>
             <w:r>
               <w:t>5h</w:t>
             </w:r>
-          </w:p>
-        </w:tc>
-        <w:tc>
-          <w:tcPr>
-            <w:tcW w:w="5103" w:type="dxa"/>
-          </w:tcPr>
-          <w:p>
-            <w:r>
-              <w:t>WPF tutoriaaleja, scrum</w:t>
-            </w:r>
+            <w:proofErr w:type="gramEnd"/>
+          </w:p>
+        </w:tc>
+        <w:tc>
+          <w:tcPr>
+            <w:tcW w:w="5103" w:type="dxa"/>
+          </w:tcPr>
+          <w:p>
+            <w:r>
+              <w:t xml:space="preserve">WPF tutoriaaleja, </w:t>
+            </w:r>
+            <w:proofErr w:type="spellStart"/>
+            <w:r>
+              <w:t>scrum</w:t>
+            </w:r>
+            <w:proofErr w:type="spellEnd"/>
             <w:r>
               <w:t>-tiimipalaveri, harjoitus version aloitus</w:t>
             </w:r>
@@ -245,8 +259,13 @@
             <w:r>
               <w:t xml:space="preserve">pari </w:t>
             </w:r>
-            <w:r>
-              <w:t xml:space="preserve">wpf </w:t>
+            <w:proofErr w:type="spellStart"/>
+            <w:r>
+              <w:t>wpf</w:t>
+            </w:r>
+            <w:proofErr w:type="spellEnd"/>
+            <w:r>
+              <w:t xml:space="preserve"> </w:t>
             </w:r>
             <w:r>
               <w:t>tutoriaalia</w:t>
@@ -294,12 +313,14 @@
             <w:tcW w:w="2551" w:type="dxa"/>
           </w:tcPr>
           <w:p>
+            <w:proofErr w:type="gramStart"/>
             <w:r>
               <w:t>2</w:t>
             </w:r>
             <w:r>
               <w:t>h</w:t>
             </w:r>
+            <w:proofErr w:type="gramEnd"/>
           </w:p>
         </w:tc>
         <w:tc>
@@ -342,8 +363,13 @@
             <w:tcW w:w="5103" w:type="dxa"/>
           </w:tcPr>
           <w:p>
-            <w:r>
-              <w:t>scrum palaveri,</w:t>
+            <w:proofErr w:type="spellStart"/>
+            <w:r>
+              <w:t>scrum</w:t>
+            </w:r>
+            <w:proofErr w:type="spellEnd"/>
+            <w:r>
+              <w:t xml:space="preserve"> palaveri,</w:t>
             </w:r>
             <w:r>
               <w:t xml:space="preserve"> Testiversio missä</w:t>
@@ -394,18 +420,25 @@
             <w:tcW w:w="2551" w:type="dxa"/>
           </w:tcPr>
           <w:p>
+            <w:proofErr w:type="gramStart"/>
             <w:r>
               <w:t>2h</w:t>
             </w:r>
-          </w:p>
-        </w:tc>
-        <w:tc>
-          <w:tcPr>
-            <w:tcW w:w="5103" w:type="dxa"/>
-          </w:tcPr>
-          <w:p>
-            <w:r>
-              <w:t>wpf testiversio</w:t>
+            <w:proofErr w:type="gramEnd"/>
+          </w:p>
+        </w:tc>
+        <w:tc>
+          <w:tcPr>
+            <w:tcW w:w="5103" w:type="dxa"/>
+          </w:tcPr>
+          <w:p>
+            <w:proofErr w:type="spellStart"/>
+            <w:r>
+              <w:t>wpf</w:t>
+            </w:r>
+            <w:proofErr w:type="spellEnd"/>
+            <w:r>
+              <w:t xml:space="preserve"> testiversio</w:t>
             </w:r>
             <w:r>
               <w:t>,</w:t>
@@ -435,18 +468,25 @@
             <w:tcW w:w="2551" w:type="dxa"/>
           </w:tcPr>
           <w:p>
+            <w:proofErr w:type="gramStart"/>
             <w:r>
               <w:t>3h</w:t>
             </w:r>
-          </w:p>
-        </w:tc>
-        <w:tc>
-          <w:tcPr>
-            <w:tcW w:w="5103" w:type="dxa"/>
-          </w:tcPr>
-          <w:p>
-            <w:r>
-              <w:t>assari tunti</w:t>
+            <w:proofErr w:type="gramEnd"/>
+          </w:p>
+        </w:tc>
+        <w:tc>
+          <w:tcPr>
+            <w:tcW w:w="5103" w:type="dxa"/>
+          </w:tcPr>
+          <w:p>
+            <w:proofErr w:type="spellStart"/>
+            <w:r>
+              <w:t>assari</w:t>
+            </w:r>
+            <w:proofErr w:type="spellEnd"/>
+            <w:r>
+              <w:t xml:space="preserve"> tunti</w:t>
             </w:r>
             <w:r>
               <w:t>, ja tiimin kanssa asioiden läpikäymistä. JSON testailua</w:t>
@@ -494,18 +534,25 @@
             <w:tcW w:w="2551" w:type="dxa"/>
           </w:tcPr>
           <w:p>
+            <w:proofErr w:type="gramStart"/>
             <w:r>
               <w:t>1h</w:t>
             </w:r>
-          </w:p>
-        </w:tc>
-        <w:tc>
-          <w:tcPr>
-            <w:tcW w:w="5103" w:type="dxa"/>
-          </w:tcPr>
-          <w:p>
-            <w:r>
-              <w:t>Mainwindow UI ilman mitään toimintoja</w:t>
+            <w:proofErr w:type="gramEnd"/>
+          </w:p>
+        </w:tc>
+        <w:tc>
+          <w:tcPr>
+            <w:tcW w:w="5103" w:type="dxa"/>
+          </w:tcPr>
+          <w:p>
+            <w:proofErr w:type="spellStart"/>
+            <w:r>
+              <w:t>Mainwindow</w:t>
+            </w:r>
+            <w:proofErr w:type="spellEnd"/>
+            <w:r>
+              <w:t xml:space="preserve"> UI ilman mitään toimintoja</w:t>
             </w:r>
           </w:p>
         </w:tc>
@@ -526,9 +573,11 @@
             <w:tcW w:w="2551" w:type="dxa"/>
           </w:tcPr>
           <w:p>
+            <w:proofErr w:type="gramStart"/>
             <w:r>
               <w:t>1h</w:t>
             </w:r>
+            <w:proofErr w:type="gramEnd"/>
           </w:p>
         </w:tc>
         <w:tc>
@@ -571,8 +620,13 @@
             <w:tcW w:w="5103" w:type="dxa"/>
           </w:tcPr>
           <w:p>
-            <w:r>
-              <w:t>scrum palaveri tiimin kanssa</w:t>
+            <w:proofErr w:type="spellStart"/>
+            <w:r>
+              <w:t>scrum</w:t>
+            </w:r>
+            <w:proofErr w:type="spellEnd"/>
+            <w:r>
+              <w:t xml:space="preserve"> palaveri tiimin kanssa</w:t>
             </w:r>
             <w:r>
               <w:t>, vaatimusmäärittely</w:t>
@@ -643,13 +697,29 @@
           <w:tcPr>
             <w:tcW w:w="2551" w:type="dxa"/>
           </w:tcPr>
-          <w:p/>
-        </w:tc>
-        <w:tc>
-          <w:tcPr>
-            <w:tcW w:w="5103" w:type="dxa"/>
-          </w:tcPr>
-          <w:p/>
+          <w:p>
+            <w:pPr>
+              <w:ind w:firstLine="720"/>
+            </w:pPr>
+            <w:r>
+              <w:t>30 min</w:t>
+            </w:r>
+          </w:p>
+        </w:tc>
+        <w:tc>
+          <w:tcPr>
+            <w:tcW w:w="5103" w:type="dxa"/>
+          </w:tcPr>
+          <w:p>
+            <w:proofErr w:type="spellStart"/>
+            <w:r>
+              <w:t>git</w:t>
+            </w:r>
+            <w:proofErr w:type="spellEnd"/>
+            <w:r>
+              <w:t xml:space="preserve"> solmun selvittelyä</w:t>
+            </w:r>
+          </w:p>
         </w:tc>
       </w:tr>
       <w:tr>

</xml_diff>

<commit_message>
Piti vetää projekti uudestaan koneelle ja uudelleen kirjottaa työaikoja.
</commit_message>
<xml_diff>
--- a/työnseuranta/Työaikaraportti - Kati.docx
+++ b/työnseuranta/Työaikaraportti - Kati.docx
@@ -698,9 +698,6 @@
             <w:tcW w:w="2551" w:type="dxa"/>
           </w:tcPr>
           <w:p>
-            <w:pPr>
-              <w:ind w:firstLine="720"/>
-            </w:pPr>
             <w:r>
               <w:t>30 min</w:t>
             </w:r>
@@ -727,159 +724,266 @@
           <w:tcPr>
             <w:tcW w:w="1980" w:type="dxa"/>
           </w:tcPr>
-          <w:p/>
-        </w:tc>
-        <w:tc>
-          <w:tcPr>
-            <w:tcW w:w="2551" w:type="dxa"/>
-          </w:tcPr>
-          <w:p/>
-        </w:tc>
-        <w:tc>
-          <w:tcPr>
-            <w:tcW w:w="5103" w:type="dxa"/>
-          </w:tcPr>
-          <w:p/>
-        </w:tc>
-      </w:tr>
-      <w:tr>
-        <w:tc>
-          <w:tcPr>
-            <w:tcW w:w="1980" w:type="dxa"/>
-          </w:tcPr>
-          <w:p/>
-        </w:tc>
-        <w:tc>
-          <w:tcPr>
-            <w:tcW w:w="2551" w:type="dxa"/>
-          </w:tcPr>
-          <w:p/>
-        </w:tc>
-        <w:tc>
-          <w:tcPr>
-            <w:tcW w:w="5103" w:type="dxa"/>
-          </w:tcPr>
-          <w:p/>
-        </w:tc>
-      </w:tr>
-      <w:tr>
-        <w:tc>
-          <w:tcPr>
-            <w:tcW w:w="1980" w:type="dxa"/>
-          </w:tcPr>
-          <w:p/>
-        </w:tc>
-        <w:tc>
-          <w:tcPr>
-            <w:tcW w:w="2551" w:type="dxa"/>
-          </w:tcPr>
-          <w:p/>
-        </w:tc>
-        <w:tc>
-          <w:tcPr>
-            <w:tcW w:w="5103" w:type="dxa"/>
-          </w:tcPr>
-          <w:p/>
-        </w:tc>
-      </w:tr>
-      <w:tr>
-        <w:tc>
-          <w:tcPr>
-            <w:tcW w:w="1980" w:type="dxa"/>
-          </w:tcPr>
-          <w:p/>
-        </w:tc>
-        <w:tc>
-          <w:tcPr>
-            <w:tcW w:w="2551" w:type="dxa"/>
-          </w:tcPr>
-          <w:p/>
-        </w:tc>
-        <w:tc>
-          <w:tcPr>
-            <w:tcW w:w="5103" w:type="dxa"/>
-          </w:tcPr>
-          <w:p/>
-        </w:tc>
-      </w:tr>
-      <w:tr>
-        <w:tc>
-          <w:tcPr>
-            <w:tcW w:w="1980" w:type="dxa"/>
-          </w:tcPr>
-          <w:p/>
-        </w:tc>
-        <w:tc>
-          <w:tcPr>
-            <w:tcW w:w="2551" w:type="dxa"/>
-          </w:tcPr>
-          <w:p/>
-        </w:tc>
-        <w:tc>
-          <w:tcPr>
-            <w:tcW w:w="5103" w:type="dxa"/>
-          </w:tcPr>
-          <w:p/>
-        </w:tc>
-      </w:tr>
-      <w:tr>
-        <w:tc>
-          <w:tcPr>
-            <w:tcW w:w="1980" w:type="dxa"/>
-          </w:tcPr>
-          <w:p/>
-        </w:tc>
-        <w:tc>
-          <w:tcPr>
-            <w:tcW w:w="2551" w:type="dxa"/>
-          </w:tcPr>
-          <w:p/>
-        </w:tc>
-        <w:tc>
-          <w:tcPr>
-            <w:tcW w:w="5103" w:type="dxa"/>
-          </w:tcPr>
-          <w:p/>
-        </w:tc>
-      </w:tr>
-      <w:tr>
-        <w:tc>
-          <w:tcPr>
-            <w:tcW w:w="1980" w:type="dxa"/>
-          </w:tcPr>
-          <w:p/>
-        </w:tc>
-        <w:tc>
-          <w:tcPr>
-            <w:tcW w:w="2551" w:type="dxa"/>
-          </w:tcPr>
-          <w:p/>
-        </w:tc>
-        <w:tc>
-          <w:tcPr>
-            <w:tcW w:w="5103" w:type="dxa"/>
-          </w:tcPr>
-          <w:p/>
-        </w:tc>
-      </w:tr>
-      <w:tr>
-        <w:tc>
-          <w:tcPr>
-            <w:tcW w:w="1980" w:type="dxa"/>
-          </w:tcPr>
-          <w:p/>
-        </w:tc>
-        <w:tc>
-          <w:tcPr>
-            <w:tcW w:w="2551" w:type="dxa"/>
-          </w:tcPr>
-          <w:p/>
-        </w:tc>
-        <w:tc>
-          <w:tcPr>
-            <w:tcW w:w="5103" w:type="dxa"/>
-          </w:tcPr>
-          <w:p/>
+          <w:p>
+            <w:r>
+              <w:t>3.10</w:t>
+            </w:r>
+          </w:p>
+        </w:tc>
+        <w:tc>
+          <w:tcPr>
+            <w:tcW w:w="2551" w:type="dxa"/>
+          </w:tcPr>
+          <w:p>
+            <w:proofErr w:type="gramStart"/>
+            <w:r>
+              <w:t>3h</w:t>
+            </w:r>
+            <w:proofErr w:type="gramEnd"/>
+          </w:p>
+        </w:tc>
+        <w:tc>
+          <w:tcPr>
+            <w:tcW w:w="5103" w:type="dxa"/>
+          </w:tcPr>
+          <w:p>
+            <w:r>
+              <w:t xml:space="preserve">pidettiin extra palaveria ja korjailtiin </w:t>
+            </w:r>
+            <w:proofErr w:type="spellStart"/>
+            <w:r>
+              <w:t>git</w:t>
+            </w:r>
+            <w:proofErr w:type="spellEnd"/>
+            <w:r>
+              <w:t xml:space="preserve"> solmua lisää, projektin </w:t>
+            </w:r>
+            <w:proofErr w:type="spellStart"/>
+            <w:r>
+              <w:t>nuketus</w:t>
+            </w:r>
+            <w:proofErr w:type="spellEnd"/>
+            <w:r>
+              <w:t xml:space="preserve"> ja </w:t>
+            </w:r>
+            <w:proofErr w:type="spellStart"/>
+            <w:r>
+              <w:t>uusiks</w:t>
+            </w:r>
+            <w:proofErr w:type="spellEnd"/>
+            <w:r>
+              <w:t xml:space="preserve"> koneelle</w:t>
+            </w:r>
+          </w:p>
+        </w:tc>
+      </w:tr>
+      <w:tr>
+        <w:tc>
+          <w:tcPr>
+            <w:tcW w:w="1980" w:type="dxa"/>
+          </w:tcPr>
+          <w:p>
+            <w:r>
+              <w:t>4.10</w:t>
+            </w:r>
+          </w:p>
+        </w:tc>
+        <w:tc>
+          <w:tcPr>
+            <w:tcW w:w="2551" w:type="dxa"/>
+          </w:tcPr>
+          <w:p/>
+        </w:tc>
+        <w:tc>
+          <w:tcPr>
+            <w:tcW w:w="5103" w:type="dxa"/>
+          </w:tcPr>
+          <w:p/>
+        </w:tc>
+      </w:tr>
+      <w:tr>
+        <w:tc>
+          <w:tcPr>
+            <w:tcW w:w="1980" w:type="dxa"/>
+          </w:tcPr>
+          <w:p>
+            <w:r>
+              <w:t>5.10</w:t>
+            </w:r>
+          </w:p>
+        </w:tc>
+        <w:tc>
+          <w:tcPr>
+            <w:tcW w:w="2551" w:type="dxa"/>
+          </w:tcPr>
+          <w:p>
+            <w:proofErr w:type="gramStart"/>
+            <w:r>
+              <w:t>7h</w:t>
+            </w:r>
+            <w:proofErr w:type="gramEnd"/>
+          </w:p>
+        </w:tc>
+        <w:tc>
+          <w:tcPr>
+            <w:tcW w:w="5103" w:type="dxa"/>
+          </w:tcPr>
+          <w:p>
+            <w:r>
+              <w:t>testailua</w:t>
+            </w:r>
+            <w:r>
+              <w:t xml:space="preserve"> värien kanssa projektiin</w:t>
+            </w:r>
+          </w:p>
+        </w:tc>
+      </w:tr>
+      <w:tr>
+        <w:tc>
+          <w:tcPr>
+            <w:tcW w:w="1980" w:type="dxa"/>
+          </w:tcPr>
+          <w:p>
+            <w:r>
+              <w:t>6.10</w:t>
+            </w:r>
+          </w:p>
+        </w:tc>
+        <w:tc>
+          <w:tcPr>
+            <w:tcW w:w="2551" w:type="dxa"/>
+          </w:tcPr>
+          <w:p>
+            <w:r>
+              <w:t>1h</w:t>
+            </w:r>
+          </w:p>
+        </w:tc>
+        <w:tc>
+          <w:tcPr>
+            <w:tcW w:w="5103" w:type="dxa"/>
+          </w:tcPr>
+          <w:p>
+            <w:r>
+              <w:t>tiimipalaveri</w:t>
+            </w:r>
+          </w:p>
+        </w:tc>
+      </w:tr>
+      <w:tr>
+        <w:tc>
+          <w:tcPr>
+            <w:tcW w:w="1980" w:type="dxa"/>
+          </w:tcPr>
+          <w:p>
+            <w:r>
+              <w:t>7.10</w:t>
+            </w:r>
+          </w:p>
+        </w:tc>
+        <w:tc>
+          <w:tcPr>
+            <w:tcW w:w="2551" w:type="dxa"/>
+          </w:tcPr>
+          <w:p/>
+        </w:tc>
+        <w:tc>
+          <w:tcPr>
+            <w:tcW w:w="5103" w:type="dxa"/>
+          </w:tcPr>
+          <w:p/>
+        </w:tc>
+      </w:tr>
+      <w:tr>
+        <w:tc>
+          <w:tcPr>
+            <w:tcW w:w="1980" w:type="dxa"/>
+          </w:tcPr>
+          <w:p>
+            <w:r>
+              <w:t>8.10</w:t>
+            </w:r>
+          </w:p>
+        </w:tc>
+        <w:tc>
+          <w:tcPr>
+            <w:tcW w:w="2551" w:type="dxa"/>
+          </w:tcPr>
+          <w:p/>
+        </w:tc>
+        <w:tc>
+          <w:tcPr>
+            <w:tcW w:w="5103" w:type="dxa"/>
+          </w:tcPr>
+          <w:p/>
+        </w:tc>
+      </w:tr>
+      <w:tr>
+        <w:tc>
+          <w:tcPr>
+            <w:tcW w:w="1980" w:type="dxa"/>
+          </w:tcPr>
+          <w:p>
+            <w:r>
+              <w:t>9.10</w:t>
+            </w:r>
+          </w:p>
+        </w:tc>
+        <w:tc>
+          <w:tcPr>
+            <w:tcW w:w="2551" w:type="dxa"/>
+          </w:tcPr>
+          <w:p>
+            <w:r>
+              <w:t>1h 30min</w:t>
+            </w:r>
+          </w:p>
+        </w:tc>
+        <w:tc>
+          <w:tcPr>
+            <w:tcW w:w="5103" w:type="dxa"/>
+          </w:tcPr>
+          <w:p>
+            <w:proofErr w:type="spellStart"/>
+            <w:r>
+              <w:t>assaritunti</w:t>
+            </w:r>
+            <w:proofErr w:type="spellEnd"/>
+          </w:p>
+        </w:tc>
+      </w:tr>
+      <w:tr>
+        <w:tc>
+          <w:tcPr>
+            <w:tcW w:w="1980" w:type="dxa"/>
+          </w:tcPr>
+          <w:p>
+            <w:r>
+              <w:t>10.10</w:t>
+            </w:r>
+          </w:p>
+        </w:tc>
+        <w:tc>
+          <w:tcPr>
+            <w:tcW w:w="2551" w:type="dxa"/>
+          </w:tcPr>
+          <w:p/>
+        </w:tc>
+        <w:tc>
+          <w:tcPr>
+            <w:tcW w:w="5103" w:type="dxa"/>
+          </w:tcPr>
+          <w:p>
+            <w:r>
+              <w:t>Väripalettien tekoa</w:t>
+            </w:r>
+            <w:r>
+              <w:t xml:space="preserve"> ja testailua</w:t>
+            </w:r>
+            <w:r>
+              <w:t xml:space="preserve">, </w:t>
+            </w:r>
+          </w:p>
         </w:tc>
       </w:tr>
       <w:tr>

</xml_diff>

<commit_message>
toivotaan ettei kaikki mee solmuun. Työaikaraportti muutoksia, vaatimusmäärittely muokkauksia, pieniä design muutoksia
</commit_message>
<xml_diff>
--- a/työnseuranta/Työaikaraportti - Kati.docx
+++ b/työnseuranta/Työaikaraportti - Kati.docx
@@ -967,7 +967,13 @@
           <w:tcPr>
             <w:tcW w:w="2551" w:type="dxa"/>
           </w:tcPr>
-          <w:p/>
+          <w:p>
+            <w:proofErr w:type="gramStart"/>
+            <w:r>
+              <w:t>5h</w:t>
+            </w:r>
+            <w:proofErr w:type="gramEnd"/>
+          </w:p>
         </w:tc>
         <w:tc>
           <w:tcPr>
@@ -981,7 +987,18 @@
               <w:t xml:space="preserve"> ja testailua</w:t>
             </w:r>
             <w:r>
-              <w:t xml:space="preserve">, </w:t>
+              <w:t>,</w:t>
+            </w:r>
+            <w:r>
+              <w:t xml:space="preserve"> design muokkauksia, taas piti </w:t>
+            </w:r>
+            <w:proofErr w:type="spellStart"/>
+            <w:r>
+              <w:t>nukettaa</w:t>
+            </w:r>
+            <w:proofErr w:type="spellEnd"/>
+            <w:r>
+              <w:t xml:space="preserve"> koko paska ja vetää repo uudelleen koneelle</w:t>
             </w:r>
           </w:p>
         </w:tc>

</xml_diff>

<commit_message>
UML lisäys kansioon, työaika muutoksia
</commit_message>
<xml_diff>
--- a/työnseuranta/Työaikaraportti - Kati.docx
+++ b/työnseuranta/Työaikaraportti - Kati.docx
@@ -1008,59 +1008,139 @@
           <w:tcPr>
             <w:tcW w:w="1980" w:type="dxa"/>
           </w:tcPr>
-          <w:p/>
-        </w:tc>
-        <w:tc>
-          <w:tcPr>
-            <w:tcW w:w="2551" w:type="dxa"/>
-          </w:tcPr>
-          <w:p/>
-        </w:tc>
-        <w:tc>
-          <w:tcPr>
-            <w:tcW w:w="5103" w:type="dxa"/>
-          </w:tcPr>
-          <w:p/>
-        </w:tc>
-      </w:tr>
-      <w:tr>
-        <w:tc>
-          <w:tcPr>
-            <w:tcW w:w="1980" w:type="dxa"/>
-          </w:tcPr>
-          <w:p/>
-        </w:tc>
-        <w:tc>
-          <w:tcPr>
-            <w:tcW w:w="2551" w:type="dxa"/>
-          </w:tcPr>
-          <w:p/>
-        </w:tc>
-        <w:tc>
-          <w:tcPr>
-            <w:tcW w:w="5103" w:type="dxa"/>
-          </w:tcPr>
-          <w:p/>
-        </w:tc>
-      </w:tr>
-      <w:tr>
-        <w:tc>
-          <w:tcPr>
-            <w:tcW w:w="1980" w:type="dxa"/>
-          </w:tcPr>
-          <w:p/>
-        </w:tc>
-        <w:tc>
-          <w:tcPr>
-            <w:tcW w:w="2551" w:type="dxa"/>
-          </w:tcPr>
-          <w:p/>
-        </w:tc>
-        <w:tc>
-          <w:tcPr>
-            <w:tcW w:w="5103" w:type="dxa"/>
-          </w:tcPr>
-          <w:p/>
+          <w:p>
+            <w:r>
+              <w:lastRenderedPageBreak/>
+              <w:t>11.10</w:t>
+            </w:r>
+          </w:p>
+        </w:tc>
+        <w:tc>
+          <w:tcPr>
+            <w:tcW w:w="2551" w:type="dxa"/>
+          </w:tcPr>
+          <w:p>
+            <w:proofErr w:type="gramStart"/>
+            <w:r>
+              <w:t>8h</w:t>
+            </w:r>
+            <w:proofErr w:type="gramEnd"/>
+          </w:p>
+        </w:tc>
+        <w:tc>
+          <w:tcPr>
+            <w:tcW w:w="5103" w:type="dxa"/>
+          </w:tcPr>
+          <w:p>
+            <w:r>
+              <w:t>Yritetty yhten</w:t>
+            </w:r>
+            <w:r>
+              <w:t>ä</w:t>
+            </w:r>
+            <w:r>
+              <w:t>i</w:t>
+            </w:r>
+            <w:r>
+              <w:t>s</w:t>
+            </w:r>
+            <w:r>
+              <w:t xml:space="preserve">tää </w:t>
+            </w:r>
+            <w:r>
+              <w:t xml:space="preserve">ikkunoiden pohjia, hankalaa. Visual </w:t>
+            </w:r>
+            <w:proofErr w:type="spellStart"/>
+            <w:r>
+              <w:t>studioki</w:t>
+            </w:r>
+            <w:proofErr w:type="spellEnd"/>
+            <w:r>
+              <w:t xml:space="preserve"> </w:t>
+            </w:r>
+            <w:proofErr w:type="spellStart"/>
+            <w:r>
+              <w:t>sekos</w:t>
+            </w:r>
+            <w:proofErr w:type="spellEnd"/>
+            <w:r>
+              <w:t>.</w:t>
+            </w:r>
+          </w:p>
+        </w:tc>
+      </w:tr>
+      <w:tr>
+        <w:tc>
+          <w:tcPr>
+            <w:tcW w:w="1980" w:type="dxa"/>
+          </w:tcPr>
+          <w:p>
+            <w:r>
+              <w:t>12.10</w:t>
+            </w:r>
+          </w:p>
+        </w:tc>
+        <w:tc>
+          <w:tcPr>
+            <w:tcW w:w="2551" w:type="dxa"/>
+          </w:tcPr>
+          <w:p>
+            <w:proofErr w:type="gramStart"/>
+            <w:r>
+              <w:t>1h</w:t>
+            </w:r>
+            <w:proofErr w:type="gramEnd"/>
+          </w:p>
+        </w:tc>
+        <w:tc>
+          <w:tcPr>
+            <w:tcW w:w="5103" w:type="dxa"/>
+          </w:tcPr>
+          <w:p>
+            <w:proofErr w:type="spellStart"/>
+            <w:r>
+              <w:t>MInipalaver</w:t>
+            </w:r>
+            <w:r>
+              <w:t>i</w:t>
+            </w:r>
+            <w:proofErr w:type="spellEnd"/>
+          </w:p>
+        </w:tc>
+      </w:tr>
+      <w:tr>
+        <w:tc>
+          <w:tcPr>
+            <w:tcW w:w="1980" w:type="dxa"/>
+          </w:tcPr>
+          <w:p>
+            <w:r>
+              <w:t>13.10</w:t>
+            </w:r>
+          </w:p>
+        </w:tc>
+        <w:tc>
+          <w:tcPr>
+            <w:tcW w:w="2551" w:type="dxa"/>
+          </w:tcPr>
+          <w:p>
+            <w:r>
+              <w:t>3h</w:t>
+            </w:r>
+          </w:p>
+        </w:tc>
+        <w:tc>
+          <w:tcPr>
+            <w:tcW w:w="5103" w:type="dxa"/>
+          </w:tcPr>
+          <w:p>
+            <w:r>
+              <w:t>tiimipalaveri</w:t>
+            </w:r>
+            <w:r>
+              <w:t>, dokumenttien tekoa</w:t>
+            </w:r>
+          </w:p>
         </w:tc>
       </w:tr>
       <w:tr>

</xml_diff>